<commit_message>
Capturas e diagrama em alta resolução
Co-Authored-By: Claude Opus 5.5 (1M context) <noreply@anthropic.com>
</commit_message>
<xml_diff>
--- a/relatorio/Relatorio_Tecnico_Threads.docx
+++ b/relatorio/Relatorio_Tecnico_Threads.docx
@@ -2134,7 +2134,7 @@
       <w:r>
         <w:drawing>
           <wp:inline xmlns:a="http://schemas.openxmlformats.org/drawingml/2006/main" xmlns:pic="http://schemas.openxmlformats.org/drawingml/2006/picture">
-            <wp:extent cx="5400000" cy="4457455"/>
+            <wp:extent cx="5400000" cy="5036727"/>
             <wp:docPr id="2" name="Picture 2"/>
             <wp:cNvGraphicFramePr>
               <a:graphicFrameLocks noChangeAspect="1"/>
@@ -2155,7 +2155,7 @@
                   <pic:spPr>
                     <a:xfrm>
                       <a:off x="0" y="0"/>
-                      <a:ext cx="5400000" cy="4457455"/>
+                      <a:ext cx="5400000" cy="5036727"/>
                     </a:xfrm>
                     <a:prstGeom prst="rect"/>
                   </pic:spPr>
@@ -2329,7 +2329,7 @@
       <w:r>
         <w:drawing>
           <wp:inline xmlns:a="http://schemas.openxmlformats.org/drawingml/2006/main" xmlns:pic="http://schemas.openxmlformats.org/drawingml/2006/picture">
-            <wp:extent cx="5400000" cy="4194317"/>
+            <wp:extent cx="5400000" cy="6538909"/>
             <wp:docPr id="3" name="Picture 3"/>
             <wp:cNvGraphicFramePr>
               <a:graphicFrameLocks noChangeAspect="1"/>
@@ -2350,7 +2350,7 @@
                   <pic:spPr>
                     <a:xfrm>
                       <a:off x="0" y="0"/>
-                      <a:ext cx="5400000" cy="4194317"/>
+                      <a:ext cx="5400000" cy="6538909"/>
                     </a:xfrm>
                     <a:prstGeom prst="rect"/>
                   </pic:spPr>
@@ -2380,7 +2380,7 @@
       <w:r>
         <w:drawing>
           <wp:inline xmlns:a="http://schemas.openxmlformats.org/drawingml/2006/main" xmlns:pic="http://schemas.openxmlformats.org/drawingml/2006/picture">
-            <wp:extent cx="5400000" cy="3951052"/>
+            <wp:extent cx="5400000" cy="6538909"/>
             <wp:docPr id="4" name="Picture 4"/>
             <wp:cNvGraphicFramePr>
               <a:graphicFrameLocks noChangeAspect="1"/>
@@ -2401,7 +2401,7 @@
                   <pic:spPr>
                     <a:xfrm>
                       <a:off x="0" y="0"/>
-                      <a:ext cx="5400000" cy="3951052"/>
+                      <a:ext cx="5400000" cy="6538909"/>
                     </a:xfrm>
                     <a:prstGeom prst="rect"/>
                   </pic:spPr>
@@ -2431,7 +2431,7 @@
       <w:r>
         <w:drawing>
           <wp:inline xmlns:a="http://schemas.openxmlformats.org/drawingml/2006/main" xmlns:pic="http://schemas.openxmlformats.org/drawingml/2006/picture">
-            <wp:extent cx="5400000" cy="3984062"/>
+            <wp:extent cx="5400000" cy="6538909"/>
             <wp:docPr id="5" name="Picture 5"/>
             <wp:cNvGraphicFramePr>
               <a:graphicFrameLocks noChangeAspect="1"/>
@@ -2452,7 +2452,7 @@
                   <pic:spPr>
                     <a:xfrm>
                       <a:off x="0" y="0"/>
-                      <a:ext cx="5400000" cy="3984062"/>
+                      <a:ext cx="5400000" cy="6538909"/>
                     </a:xfrm>
                     <a:prstGeom prst="rect"/>
                   </pic:spPr>
@@ -2979,7 +2979,7 @@
       <w:r>
         <w:drawing>
           <wp:inline xmlns:a="http://schemas.openxmlformats.org/drawingml/2006/main" xmlns:pic="http://schemas.openxmlformats.org/drawingml/2006/picture">
-            <wp:extent cx="5400000" cy="5279004"/>
+            <wp:extent cx="5400000" cy="6705818"/>
             <wp:docPr id="6" name="Picture 6"/>
             <wp:cNvGraphicFramePr>
               <a:graphicFrameLocks noChangeAspect="1"/>
@@ -3000,7 +3000,7 @@
                   <pic:spPr>
                     <a:xfrm>
                       <a:off x="0" y="0"/>
-                      <a:ext cx="5400000" cy="5279004"/>
+                      <a:ext cx="5400000" cy="6705818"/>
                     </a:xfrm>
                     <a:prstGeom prst="rect"/>
                   </pic:spPr>
@@ -3030,7 +3030,7 @@
       <w:r>
         <w:drawing>
           <wp:inline xmlns:a="http://schemas.openxmlformats.org/drawingml/2006/main" xmlns:pic="http://schemas.openxmlformats.org/drawingml/2006/picture">
-            <wp:extent cx="5400000" cy="5279004"/>
+            <wp:extent cx="5400000" cy="6705818"/>
             <wp:docPr id="7" name="Picture 7"/>
             <wp:cNvGraphicFramePr>
               <a:graphicFrameLocks noChangeAspect="1"/>
@@ -3051,7 +3051,7 @@
                   <pic:spPr>
                     <a:xfrm>
                       <a:off x="0" y="0"/>
-                      <a:ext cx="5400000" cy="5279004"/>
+                      <a:ext cx="5400000" cy="6705818"/>
                     </a:xfrm>
                     <a:prstGeom prst="rect"/>
                   </pic:spPr>
@@ -3212,7 +3212,7 @@
       <w:r>
         <w:drawing>
           <wp:inline xmlns:a="http://schemas.openxmlformats.org/drawingml/2006/main" xmlns:pic="http://schemas.openxmlformats.org/drawingml/2006/picture">
-            <wp:extent cx="5400000" cy="3886646"/>
+            <wp:extent cx="5400000" cy="6538909"/>
             <wp:docPr id="8" name="Picture 8"/>
             <wp:cNvGraphicFramePr>
               <a:graphicFrameLocks noChangeAspect="1"/>
@@ -3233,7 +3233,7 @@
                   <pic:spPr>
                     <a:xfrm>
                       <a:off x="0" y="0"/>
-                      <a:ext cx="5400000" cy="3886646"/>
+                      <a:ext cx="5400000" cy="6538909"/>
                     </a:xfrm>
                     <a:prstGeom prst="rect"/>
                   </pic:spPr>
@@ -3263,7 +3263,7 @@
       <w:r>
         <w:drawing>
           <wp:inline xmlns:a="http://schemas.openxmlformats.org/drawingml/2006/main" xmlns:pic="http://schemas.openxmlformats.org/drawingml/2006/picture">
-            <wp:extent cx="5400000" cy="3918584"/>
+            <wp:extent cx="5400000" cy="6538909"/>
             <wp:docPr id="9" name="Picture 9"/>
             <wp:cNvGraphicFramePr>
               <a:graphicFrameLocks noChangeAspect="1"/>
@@ -3284,7 +3284,7 @@
                   <pic:spPr>
                     <a:xfrm>
                       <a:off x="0" y="0"/>
-                      <a:ext cx="5400000" cy="3918584"/>
+                      <a:ext cx="5400000" cy="6538909"/>
                     </a:xfrm>
                     <a:prstGeom prst="rect"/>
                   </pic:spPr>
@@ -3782,7 +3782,7 @@
       <w:r>
         <w:drawing>
           <wp:inline xmlns:a="http://schemas.openxmlformats.org/drawingml/2006/main" xmlns:pic="http://schemas.openxmlformats.org/drawingml/2006/picture">
-            <wp:extent cx="5400000" cy="6519273"/>
+            <wp:extent cx="5400000" cy="7373455"/>
             <wp:docPr id="10" name="Picture 10"/>
             <wp:cNvGraphicFramePr>
               <a:graphicFrameLocks noChangeAspect="1"/>
@@ -3803,7 +3803,7 @@
                   <pic:spPr>
                     <a:xfrm>
                       <a:off x="0" y="0"/>
-                      <a:ext cx="5400000" cy="6519273"/>
+                      <a:ext cx="5400000" cy="7373455"/>
                     </a:xfrm>
                     <a:prstGeom prst="rect"/>
                   </pic:spPr>
@@ -3833,7 +3833,7 @@
       <w:r>
         <w:drawing>
           <wp:inline xmlns:a="http://schemas.openxmlformats.org/drawingml/2006/main" xmlns:pic="http://schemas.openxmlformats.org/drawingml/2006/picture">
-            <wp:extent cx="5400000" cy="6519273"/>
+            <wp:extent cx="5400000" cy="7373455"/>
             <wp:docPr id="11" name="Picture 11"/>
             <wp:cNvGraphicFramePr>
               <a:graphicFrameLocks noChangeAspect="1"/>
@@ -3854,7 +3854,7 @@
                   <pic:spPr>
                     <a:xfrm>
                       <a:off x="0" y="0"/>
-                      <a:ext cx="5400000" cy="6519273"/>
+                      <a:ext cx="5400000" cy="7373455"/>
                     </a:xfrm>
                     <a:prstGeom prst="rect"/>
                   </pic:spPr>
@@ -4401,7 +4401,7 @@
       <w:r>
         <w:drawing>
           <wp:inline xmlns:a="http://schemas.openxmlformats.org/drawingml/2006/main" xmlns:pic="http://schemas.openxmlformats.org/drawingml/2006/picture">
-            <wp:extent cx="5400000" cy="5046545"/>
+            <wp:extent cx="5400000" cy="5704364"/>
             <wp:docPr id="12" name="Picture 12"/>
             <wp:cNvGraphicFramePr>
               <a:graphicFrameLocks noChangeAspect="1"/>
@@ -4422,7 +4422,7 @@
                   <pic:spPr>
                     <a:xfrm>
                       <a:off x="0" y="0"/>
-                      <a:ext cx="5400000" cy="5046545"/>
+                      <a:ext cx="5400000" cy="5704364"/>
                     </a:xfrm>
                     <a:prstGeom prst="rect"/>
                   </pic:spPr>
@@ -4452,7 +4452,7 @@
       <w:r>
         <w:drawing>
           <wp:inline xmlns:a="http://schemas.openxmlformats.org/drawingml/2006/main" xmlns:pic="http://schemas.openxmlformats.org/drawingml/2006/picture">
-            <wp:extent cx="5400000" cy="5046545"/>
+            <wp:extent cx="5400000" cy="5704364"/>
             <wp:docPr id="13" name="Picture 13"/>
             <wp:cNvGraphicFramePr>
               <a:graphicFrameLocks noChangeAspect="1"/>
@@ -4473,7 +4473,7 @@
                   <pic:spPr>
                     <a:xfrm>
                       <a:off x="0" y="0"/>
-                      <a:ext cx="5400000" cy="5046545"/>
+                      <a:ext cx="5400000" cy="5704364"/>
                     </a:xfrm>
                     <a:prstGeom prst="rect"/>
                   </pic:spPr>
@@ -4762,7 +4762,7 @@
       <w:r>
         <w:drawing>
           <wp:inline xmlns:a="http://schemas.openxmlformats.org/drawingml/2006/main" xmlns:pic="http://schemas.openxmlformats.org/drawingml/2006/picture">
-            <wp:extent cx="5400000" cy="5046545"/>
+            <wp:extent cx="5400000" cy="5704364"/>
             <wp:docPr id="14" name="Picture 14"/>
             <wp:cNvGraphicFramePr>
               <a:graphicFrameLocks noChangeAspect="1"/>
@@ -4783,7 +4783,7 @@
                   <pic:spPr>
                     <a:xfrm>
                       <a:off x="0" y="0"/>
-                      <a:ext cx="5400000" cy="5046545"/>
+                      <a:ext cx="5400000" cy="5704364"/>
                     </a:xfrm>
                     <a:prstGeom prst="rect"/>
                   </pic:spPr>
@@ -4813,7 +4813,7 @@
       <w:r>
         <w:drawing>
           <wp:inline xmlns:a="http://schemas.openxmlformats.org/drawingml/2006/main" xmlns:pic="http://schemas.openxmlformats.org/drawingml/2006/picture">
-            <wp:extent cx="5400000" cy="5046545"/>
+            <wp:extent cx="5400000" cy="5704364"/>
             <wp:docPr id="15" name="Picture 15"/>
             <wp:cNvGraphicFramePr>
               <a:graphicFrameLocks noChangeAspect="1"/>
@@ -4834,7 +4834,7 @@
                   <pic:spPr>
                     <a:xfrm>
                       <a:off x="0" y="0"/>
-                      <a:ext cx="5400000" cy="5046545"/>
+                      <a:ext cx="5400000" cy="5704364"/>
                     </a:xfrm>
                     <a:prstGeom prst="rect"/>
                   </pic:spPr>
@@ -5058,7 +5058,7 @@
       <w:r>
         <w:drawing>
           <wp:inline xmlns:a="http://schemas.openxmlformats.org/drawingml/2006/main" xmlns:pic="http://schemas.openxmlformats.org/drawingml/2006/picture">
-            <wp:extent cx="5400000" cy="5046545"/>
+            <wp:extent cx="5400000" cy="6538909"/>
             <wp:docPr id="16" name="Picture 16"/>
             <wp:cNvGraphicFramePr>
               <a:graphicFrameLocks noChangeAspect="1"/>
@@ -5079,7 +5079,7 @@
                   <pic:spPr>
                     <a:xfrm>
                       <a:off x="0" y="0"/>
-                      <a:ext cx="5400000" cy="5046545"/>
+                      <a:ext cx="5400000" cy="6538909"/>
                     </a:xfrm>
                     <a:prstGeom prst="rect"/>
                   </pic:spPr>
@@ -5109,7 +5109,7 @@
       <w:r>
         <w:drawing>
           <wp:inline xmlns:a="http://schemas.openxmlformats.org/drawingml/2006/main" xmlns:pic="http://schemas.openxmlformats.org/drawingml/2006/picture">
-            <wp:extent cx="5400000" cy="5046545"/>
+            <wp:extent cx="5400000" cy="6538909"/>
             <wp:docPr id="17" name="Picture 17"/>
             <wp:cNvGraphicFramePr>
               <a:graphicFrameLocks noChangeAspect="1"/>
@@ -5130,7 +5130,7 @@
                   <pic:spPr>
                     <a:xfrm>
                       <a:off x="0" y="0"/>
-                      <a:ext cx="5400000" cy="5046545"/>
+                      <a:ext cx="5400000" cy="6538909"/>
                     </a:xfrm>
                     <a:prstGeom prst="rect"/>
                   </pic:spPr>

</xml_diff>

<commit_message>
Adiciona apêndice sobre uso do Claude Code
Co-Authored-By: Claude Opus 5.5 (1M context) <noreply@anthropic.com>
</commit_message>
<xml_diff>
--- a/relatorio/Relatorio_Tecnico_Threads.docx
+++ b/relatorio/Relatorio_Tecnico_Threads.docx
@@ -6297,6 +6297,111 @@
         <w:t>COULOURIS, G. et al. Sistemas Distribuídos: conceitos e projeto. 5. ed. Bookman, 2013.</w:t>
       </w:r>
     </w:p>
+    <w:p>
+      <w:r>
+        <w:br w:type="page"/>
+      </w:r>
+    </w:p>
+    <w:p>
+      <w:pPr>
+        <w:pStyle w:val="Heading1"/>
+      </w:pPr>
+      <w:r>
+        <w:t>Apêndice A – Uso de ferramenta de Inteligência Artificial</w:t>
+      </w:r>
+    </w:p>
+    <w:p>
+      <w:pPr>
+        <w:spacing w:after="120"/>
+        <w:jc w:val="both"/>
+      </w:pPr>
+      <w:r>
+        <w:rPr>
+          <w:i w:val="0"/>
+        </w:rPr>
+        <w:t>Para a análise das execuções das threads e a elaboração das considerações apresentadas neste relatório, foi utilizada a ferramenta Claude Code (Anthropic), um assistente de programação baseado em inteligência artificial executado no terminal.</w:t>
+      </w:r>
+    </w:p>
+    <w:p>
+      <w:pPr>
+        <w:spacing w:after="120"/>
+        <w:jc w:val="both"/>
+      </w:pPr>
+      <w:r>
+        <w:rPr>
+          <w:i w:val="0"/>
+        </w:rPr>
+        <w:t>A ferramenta foi empregada para:</w:t>
+      </w:r>
+    </w:p>
+    <w:p>
+      <w:pPr>
+        <w:pStyle w:val="ListBullet"/>
+      </w:pPr>
+      <w:r>
+        <w:rPr>
+          <w:b/>
+        </w:rPr>
+        <w:t xml:space="preserve">Processamento das saídas: </w:t>
+      </w:r>
+      <w:r>
+        <w:t>leitura dos arquivos gerados em cada execução (pasta saidas/), que chegavam a mais de 100 mil linhas nos exemplos com while(true).</w:t>
+      </w:r>
+    </w:p>
+    <w:p>
+      <w:pPr>
+        <w:pStyle w:val="ListBullet"/>
+      </w:pPr>
+      <w:r>
+        <w:rPr>
+          <w:b/>
+        </w:rPr>
+        <w:t xml:space="preserve">Levantamento de métricas: </w:t>
+      </w:r>
+      <w:r>
+        <w:t>contagem de impressões por racer, ordem da primeira impressão, tamanho médio das rajadas, ordem de chegada na q1f, estoque mínimo e final do depósito e número de tentativas frustradas dos consumidores.</w:t>
+      </w:r>
+    </w:p>
+    <w:p>
+      <w:pPr>
+        <w:pStyle w:val="ListBullet"/>
+      </w:pPr>
+      <w:r>
+        <w:rPr>
+          <w:b/>
+        </w:rPr>
+        <w:t xml:space="preserve">Verificações automáticas: </w:t>
+      </w:r>
+      <w:r>
+        <w:t>por exemplo, confirmar que nenhum racer par imprimiu antes do término dos ímpares (q1f) e que a soma de caixas consumidas fechava com o estoque final (q2c).</w:t>
+      </w:r>
+    </w:p>
+    <w:p>
+      <w:pPr>
+        <w:pStyle w:val="ListBullet"/>
+      </w:pPr>
+      <w:r>
+        <w:rPr>
+          <w:b/>
+        </w:rPr>
+        <w:t xml:space="preserve">Interpretação dos resultados: </w:t>
+      </w:r>
+      <w:r>
+        <w:t>relacionar os dados observados aos conceitos teóricos (escalonamento, condição de corrida, exclusão mútua, safety × liveness) e aos problemas de sistemas distribuídos.</w:t>
+      </w:r>
+    </w:p>
+    <w:p>
+      <w:pPr>
+        <w:spacing w:after="120"/>
+        <w:jc w:val="both"/>
+      </w:pPr>
+      <w:r>
+        <w:rPr>
+          <w:i w:val="0"/>
+        </w:rPr>
+        <w:t>Todos os números citados foram obtidos de execuções reais do código no ambiente descrito na Seção 2.1, e as análises foram revisadas pelo(a) autor(a) deste relatório.</w:t>
+      </w:r>
+    </w:p>
     <w:sectPr>
       <w:pgSz w:w="12240" w:h="15840"/>
       <w:pgMar w:top="1417" w:right="1134" w:bottom="1417" w:left="1701" w:header="720" w:footer="720" w:gutter="0"/>

</xml_diff>